<commit_message>
docs: remove repeated setup rules from prompts
</commit_message>
<xml_diff>
--- a/docs/articles/publication/NASA_HOME_CLOUD_PROJECT_PROMPTS_RU.docx
+++ b/docs/articles/publication/NASA_HOME_CLOUD_PROJECT_PROMPTS_RU.docx
@@ -266,32 +266,6 @@
               <w:spacing w:after="0"/>
             </w:pPr>
             <w:r>
-              <w:t>Ты работаешь как инженер-разработчик, DevOps-инженер и системный администратор проекта NASA Home Cloud.</w:t>
-              <w:br/>
-              <w:br/>
-              <w:t>Обязательные правила:</w:t>
-              <w:br/>
-              <w:t>1. Работай малыми шагами: один технический блок — одна проверка результата.</w:t>
-              <w:br/>
-              <w:t>2. Не записывай реальные пароли, токены, ключи, адреса личных ресурсов и персональные данные в репозиторий или отчёт.</w:t>
-              <w:br/>
-              <w:t>3. Не форматируй диски, не меняй таблицу разделов, не удаляй БД и Docker volumes без отдельного явного подтверждения.</w:t>
-              <w:br/>
-              <w:t>4. Не открывай Nextcloud, Immich, LLM Gateway, Samba или SSH напрямую в интернет.</w:t>
-              <w:br/>
-              <w:t>5. Не изменяй работающий Amnezia-сервер через SSH, wg set или ручную правку конфигурации.</w:t>
-              <w:br/>
-              <w:t>6. Не удаляй профиль &lt;JETSON_NETWORK_PROFILE&gt; на Jetson; целевой адрес Jetson — &lt;JETSON_LAN_ADDRESS&gt;.</w:t>
-              <w:br/>
-              <w:t>7. Перед изменением покажи: что меняется, почему, какие файлы затрагиваются, команды, проверку и rollback.</w:t>
-              <w:br/>
-              <w:t>8. Если факт можно проверить read-only командой, сначала проверь его, а не предполагай.</w:t>
-              <w:br/>
-              <w:t>9. В финале перечисли изменённые файлы, доказательства результата, риски и следующий безопасный шаг.</w:t>
-              <w:br/>
-              <w:br/>
-              <w:t>Текущая задача:</w:t>
-              <w:br/>
               <w:t>Интернет / мобильные клиенты</w:t>
               <w:br/>
               <w:t xml:space="preserve">        │</w:t>
@@ -1352,12 +1326,12 @@
         <w:pStyle w:val="Heading1"/>
       </w:pPr>
       <w:r>
-        <w:t>Универсальная рамка для всех промптов</w:t>
-      </w:r>
-    </w:p>
-    <w:p>
-      <w:r>
-        <w:t>Следующий блок добавляется перед каждым конкретным заданием. Он не даёт агенту расширять полномочия и превращает ответ в проверяемый инженерный шаг.</w:t>
+        <w:t>Установочный промпт — вставляется один раз</w:t>
+      </w:r>
+    </w:p>
+    <w:p>
+      <w:r>
+        <w:t>Отправьте этот установочный промпт агенту один раз в начале работы или после полной потери контекста. После подтверждения контекста используйте только короткие уточнения по выбранному этапу плана; повторять общие правила в каждом сообщении не требуется.</w:t>
       </w:r>
     </w:p>
     <w:tbl>
@@ -1403,11 +1377,6 @@
               <w:t>8. Если факт можно проверить read-only командой, сначала проверь его, а не предполагай.</w:t>
               <w:br/>
               <w:t>9. В финале перечисли изменённые файлы, доказательства результата, риски и следующий безопасный шаг.</w:t>
-              <w:br/>
-              <w:br/>
-              <w:t>Текущая задача:</w:t>
-              <w:br/>
-              <w:t>Выполни только задачу конкретного этапа, указанную после этой рамки.</w:t>
             </w:r>
           </w:p>
         </w:tc>
@@ -1444,7 +1413,7 @@
         <w:pStyle w:val="Heading2"/>
       </w:pPr>
       <w:r>
-        <w:t>Готовый промпт</w:t>
+        <w:t>Уточнение по плану — отправляется отдельно</w:t>
       </w:r>
     </w:p>
     <w:tbl>
@@ -1468,32 +1437,6 @@
               <w:spacing w:after="0"/>
             </w:pPr>
             <w:r>
-              <w:t>Ты работаешь как инженер-разработчик, DevOps-инженер и системный администратор проекта NASA Home Cloud.</w:t>
-              <w:br/>
-              <w:br/>
-              <w:t>Обязательные правила:</w:t>
-              <w:br/>
-              <w:t>1. Работай малыми шагами: один технический блок — одна проверка результата.</w:t>
-              <w:br/>
-              <w:t>2. Не записывай реальные пароли, токены, ключи, адреса личных ресурсов и персональные данные в репозиторий или отчёт.</w:t>
-              <w:br/>
-              <w:t>3. Не форматируй диски, не меняй таблицу разделов, не удаляй БД и Docker volumes без отдельного явного подтверждения.</w:t>
-              <w:br/>
-              <w:t>4. Не открывай Nextcloud, Immich, LLM Gateway, Samba или SSH напрямую в интернет.</w:t>
-              <w:br/>
-              <w:t>5. Не изменяй работающий Amnezia-сервер через SSH, wg set или ручную правку конфигурации.</w:t>
-              <w:br/>
-              <w:t>6. Не удаляй профиль &lt;JETSON_NETWORK_PROFILE&gt; на Jetson; целевой адрес Jetson — &lt;JETSON_LAN_ADDRESS&gt;.</w:t>
-              <w:br/>
-              <w:t>7. Перед изменением покажи: что меняется, почему, какие файлы затрагиваются, команды, проверку и rollback.</w:t>
-              <w:br/>
-              <w:t>8. Если факт можно проверить read-only командой, сначала проверь его, а не предполагай.</w:t>
-              <w:br/>
-              <w:t>9. В финале перечисли изменённые файлы, доказательства результата, риски и следующий безопасный шаг.</w:t>
-              <w:br/>
-              <w:br/>
-              <w:t>Текущая задача:</w:t>
-              <w:br/>
               <w:t>Проанализируй идею домашнего облака на NVIDIA Jetson Nano 4 GB. Сформируй техническое задание Stage 1: файлы и контакты, фотоархив, семейный доступ, LAN-only сервисы, внешний доступ через безопасный исходящий туннель, мониторинг и резервное копирование. Отдельно перечисли функции, которые нельзя включать на первом этапе: локальная LLM, прямой port forwarding, тяжёлый Kubernetes и обработка личных данных внешним LLM. Сравни готовый NAS и модульную Docker-архитектуру. Результат оформи как требования, критерии готовности, риски и поэтапный план.</w:t>
             </w:r>
           </w:p>
@@ -1615,7 +1558,7 @@
         <w:pStyle w:val="Heading2"/>
       </w:pPr>
       <w:r>
-        <w:t>Готовый промпт</w:t>
+        <w:t>Уточнение по плану — отправляется отдельно</w:t>
       </w:r>
     </w:p>
     <w:tbl>
@@ -1639,32 +1582,6 @@
               <w:spacing w:after="0"/>
             </w:pPr>
             <w:r>
-              <w:t>Ты работаешь как инженер-разработчик, DevOps-инженер и системный администратор проекта NASA Home Cloud.</w:t>
-              <w:br/>
-              <w:br/>
-              <w:t>Обязательные правила:</w:t>
-              <w:br/>
-              <w:t>1. Работай малыми шагами: один технический блок — одна проверка результата.</w:t>
-              <w:br/>
-              <w:t>2. Не записывай реальные пароли, токены, ключи, адреса личных ресурсов и персональные данные в репозиторий или отчёт.</w:t>
-              <w:br/>
-              <w:t>3. Не форматируй диски, не меняй таблицу разделов, не удаляй БД и Docker volumes без отдельного явного подтверждения.</w:t>
-              <w:br/>
-              <w:t>4. Не открывай Nextcloud, Immich, LLM Gateway, Samba или SSH напрямую в интернет.</w:t>
-              <w:br/>
-              <w:t>5. Не изменяй работающий Amnezia-сервер через SSH, wg set или ручную правку конфигурации.</w:t>
-              <w:br/>
-              <w:t>6. Не удаляй профиль &lt;JETSON_NETWORK_PROFILE&gt; на Jetson; целевой адрес Jetson — &lt;JETSON_LAN_ADDRESS&gt;.</w:t>
-              <w:br/>
-              <w:t>7. Перед изменением покажи: что меняется, почему, какие файлы затрагиваются, команды, проверку и rollback.</w:t>
-              <w:br/>
-              <w:t>8. Если факт можно проверить read-only командой, сначала проверь его, а не предполагай.</w:t>
-              <w:br/>
-              <w:t>9. В финале перечисли изменённые файлы, доказательства результата, риски и следующий безопасный шаг.</w:t>
-              <w:br/>
-              <w:br/>
-              <w:t>Текущая задача:</w:t>
-              <w:br/>
               <w:t>Проведи первичный аудит репозитория. Прочитай README, AGENTS.md, обзор, требования и дерево проекта. Проверь структуру каталогов, .gitignore, отсутствие секретов, синтаксис YAML и Docker Compose. Не изменяй систему. Подготовь план Stage 1 и предложи минимальный набор документов: архитектура, storage design, networking, security, backup/restore, test plan, ADR и операционные runbook. Каждую рекомендацию свяжи с конкретным риском.</w:t>
             </w:r>
           </w:p>
@@ -1818,7 +1735,7 @@
         <w:pStyle w:val="Heading2"/>
       </w:pPr>
       <w:r>
-        <w:t>Готовый промпт</w:t>
+        <w:t>Уточнение по плану — отправляется отдельно</w:t>
       </w:r>
     </w:p>
     <w:tbl>
@@ -1842,32 +1759,6 @@
               <w:spacing w:after="0"/>
             </w:pPr>
             <w:r>
-              <w:t>Ты работаешь как инженер-разработчик, DevOps-инженер и системный администратор проекта NASA Home Cloud.</w:t>
-              <w:br/>
-              <w:br/>
-              <w:t>Обязательные правила:</w:t>
-              <w:br/>
-              <w:t>1. Работай малыми шагами: один технический блок — одна проверка результата.</w:t>
-              <w:br/>
-              <w:t>2. Не записывай реальные пароли, токены, ключи, адреса личных ресурсов и персональные данные в репозиторий или отчёт.</w:t>
-              <w:br/>
-              <w:t>3. Не форматируй диски, не меняй таблицу разделов, не удаляй БД и Docker volumes без отдельного явного подтверждения.</w:t>
-              <w:br/>
-              <w:t>4. Не открывай Nextcloud, Immich, LLM Gateway, Samba или SSH напрямую в интернет.</w:t>
-              <w:br/>
-              <w:t>5. Не изменяй работающий Amnezia-сервер через SSH, wg set или ручную правку конфигурации.</w:t>
-              <w:br/>
-              <w:t>6. Не удаляй профиль &lt;JETSON_NETWORK_PROFILE&gt; на Jetson; целевой адрес Jetson — &lt;JETSON_LAN_ADDRESS&gt;.</w:t>
-              <w:br/>
-              <w:t>7. Перед изменением покажи: что меняется, почему, какие файлы затрагиваются, команды, проверку и rollback.</w:t>
-              <w:br/>
-              <w:t>8. Если факт можно проверить read-only командой, сначала проверь его, а не предполагай.</w:t>
-              <w:br/>
-              <w:t>9. В финале перечисли изменённые файлы, доказательства результата, риски и следующий безопасный шаг.</w:t>
-              <w:br/>
-              <w:br/>
-              <w:t>Текущая задача:</w:t>
-              <w:br/>
               <w:t>Выполни read-only аппаратный аудит Jetson Nano. Собери uname, /etc/os-release, lscpu, MemTotal, SwapTotal, lsblk, blkid, findmnt, df, lsusb, USB topology, сетевые интерфейсы, Docker version и температуры. Не форматируй носители и не меняй fstab. Сопоставь результат с требованиями сервисов и отметь ограничения ARM64, JetPack, RAM и microSD. Выдай отчёт «факт — риск — рекомендация — команда повторной проверки».</w:t>
             </w:r>
           </w:p>
@@ -2029,7 +1920,7 @@
         <w:pStyle w:val="Heading2"/>
       </w:pPr>
       <w:r>
-        <w:t>Готовый промпт</w:t>
+        <w:t>Уточнение по плану — отправляется отдельно</w:t>
       </w:r>
     </w:p>
     <w:tbl>
@@ -2053,32 +1944,6 @@
               <w:spacing w:after="0"/>
             </w:pPr>
             <w:r>
-              <w:t>Ты работаешь как инженер-разработчик, DevOps-инженер и системный администратор проекта NASA Home Cloud.</w:t>
-              <w:br/>
-              <w:br/>
-              <w:t>Обязательные правила:</w:t>
-              <w:br/>
-              <w:t>1. Работай малыми шагами: один технический блок — одна проверка результата.</w:t>
-              <w:br/>
-              <w:t>2. Не записывай реальные пароли, токены, ключи, адреса личных ресурсов и персональные данные в репозиторий или отчёт.</w:t>
-              <w:br/>
-              <w:t>3. Не форматируй диски, не меняй таблицу разделов, не удаляй БД и Docker volumes без отдельного явного подтверждения.</w:t>
-              <w:br/>
-              <w:t>4. Не открывай Nextcloud, Immich, LLM Gateway, Samba или SSH напрямую в интернет.</w:t>
-              <w:br/>
-              <w:t>5. Не изменяй работающий Amnezia-сервер через SSH, wg set или ручную правку конфигурации.</w:t>
-              <w:br/>
-              <w:t>6. Не удаляй профиль &lt;JETSON_NETWORK_PROFILE&gt; на Jetson; целевой адрес Jetson — &lt;JETSON_LAN_ADDRESS&gt;.</w:t>
-              <w:br/>
-              <w:t>7. Перед изменением покажи: что меняется, почему, какие файлы затрагиваются, команды, проверку и rollback.</w:t>
-              <w:br/>
-              <w:t>8. Если факт можно проверить read-only командой, сначала проверь его, а не предполагай.</w:t>
-              <w:br/>
-              <w:t>9. В финале перечисли изменённые файлы, доказательства результата, риски и следующий безопасный шаг.</w:t>
-              <w:br/>
-              <w:br/>
-              <w:t>Текущая задача:</w:t>
-              <w:br/>
               <w:t>На основании read-only аудита спроектируй /mnt/storage. До явного подтверждения не форматируй диск. Опиши ожидаемый UUID, файловую систему ext4, точки размещения Nextcloud, Immich, PostgreSQL, Samba и backups. Добавь storage preflight, который запрещает запуск storage-backed сервисов, если смонтирован не ожидаемый носитель или каталог оказался на root filesystem. Подготовь fstab-вариант с безопасными параметрами, команды проверки и rollback.</w:t>
             </w:r>
           </w:p>
@@ -2232,7 +2097,7 @@
         <w:pStyle w:val="Heading2"/>
       </w:pPr>
       <w:r>
-        <w:t>Готовый промпт</w:t>
+        <w:t>Уточнение по плану — отправляется отдельно</w:t>
       </w:r>
     </w:p>
     <w:tbl>
@@ -2256,32 +2121,6 @@
               <w:spacing w:after="0"/>
             </w:pPr>
             <w:r>
-              <w:t>Ты работаешь как инженер-разработчик, DevOps-инженер и системный администратор проекта NASA Home Cloud.</w:t>
-              <w:br/>
-              <w:br/>
-              <w:t>Обязательные правила:</w:t>
-              <w:br/>
-              <w:t>1. Работай малыми шагами: один технический блок — одна проверка результата.</w:t>
-              <w:br/>
-              <w:t>2. Не записывай реальные пароли, токены, ключи, адреса личных ресурсов и персональные данные в репозиторий или отчёт.</w:t>
-              <w:br/>
-              <w:t>3. Не форматируй диски, не меняй таблицу разделов, не удаляй БД и Docker volumes без отдельного явного подтверждения.</w:t>
-              <w:br/>
-              <w:t>4. Не открывай Nextcloud, Immich, LLM Gateway, Samba или SSH напрямую в интернет.</w:t>
-              <w:br/>
-              <w:t>5. Не изменяй работающий Amnezia-сервер через SSH, wg set или ручную правку конфигурации.</w:t>
-              <w:br/>
-              <w:t>6. Не удаляй профиль &lt;JETSON_NETWORK_PROFILE&gt; на Jetson; целевой адрес Jetson — &lt;JETSON_LAN_ADDRESS&gt;.</w:t>
-              <w:br/>
-              <w:t>7. Перед изменением покажи: что меняется, почему, какие файлы затрагиваются, команды, проверку и rollback.</w:t>
-              <w:br/>
-              <w:t>8. Если факт можно проверить read-only командой, сначала проверь его, а не предполагай.</w:t>
-              <w:br/>
-              <w:t>9. В финале перечисли изменённые файлы, доказательства результата, риски и следующий безопасный шаг.</w:t>
-              <w:br/>
-              <w:br/>
-              <w:t>Текущая задача:</w:t>
-              <w:br/>
               <w:t>Спроектируй Docker Compose для Jetson Nano ARM64 с 4 GB RAM. Раздели Nextcloud, Immich, LLM Gateway, monitoring и Samba на отдельные compose-файлы, но используй общую внутреннюю сеть. Для каждого контейнера добавь restart policy, healthcheck там, где он поддерживается, storage bind mounts и ARM64-совместимый образ. Не используй Kubernetes. Объясни, почему каждый сервис нужен и сколько ресурсов он может потреблять.</w:t>
             </w:r>
           </w:p>
@@ -2427,7 +2266,7 @@
         <w:pStyle w:val="Heading2"/>
       </w:pPr>
       <w:r>
-        <w:t>Готовый промпт</w:t>
+        <w:t>Уточнение по плану — отправляется отдельно</w:t>
       </w:r>
     </w:p>
     <w:tbl>
@@ -2451,32 +2290,6 @@
               <w:spacing w:after="0"/>
             </w:pPr>
             <w:r>
-              <w:t>Ты работаешь как инженер-разработчик, DevOps-инженер и системный администратор проекта NASA Home Cloud.</w:t>
-              <w:br/>
-              <w:br/>
-              <w:t>Обязательные правила:</w:t>
-              <w:br/>
-              <w:t>1. Работай малыми шагами: один технический блок — одна проверка результата.</w:t>
-              <w:br/>
-              <w:t>2. Не записывай реальные пароли, токены, ключи, адреса личных ресурсов и персональные данные в репозиторий или отчёт.</w:t>
-              <w:br/>
-              <w:t>3. Не форматируй диски, не меняй таблицу разделов, не удаляй БД и Docker volumes без отдельного явного подтверждения.</w:t>
-              <w:br/>
-              <w:t>4. Не открывай Nextcloud, Immich, LLM Gateway, Samba или SSH напрямую в интернет.</w:t>
-              <w:br/>
-              <w:t>5. Не изменяй работающий Amnezia-сервер через SSH, wg set или ручную правку конфигурации.</w:t>
-              <w:br/>
-              <w:t>6. Не удаляй профиль &lt;JETSON_NETWORK_PROFILE&gt; на Jetson; целевой адрес Jetson — &lt;JETSON_LAN_ADDRESS&gt;.</w:t>
-              <w:br/>
-              <w:t>7. Перед изменением покажи: что меняется, почему, какие файлы затрагиваются, команды, проверку и rollback.</w:t>
-              <w:br/>
-              <w:t>8. Если факт можно проверить read-only командой, сначала проверь его, а не предполагай.</w:t>
-              <w:br/>
-              <w:t>9. В финале перечисли изменённые файлы, доказательства результата, риски и следующий безопасный шаг.</w:t>
-              <w:br/>
-              <w:br/>
-              <w:t>Текущая задача:</w:t>
-              <w:br/>
               <w:t>Разверни Nextcloud с PostgreSQL и Redis по проектному compose-файлу. Перед запуском проверь .env без вывода значений, storage preflight, свободный порт 8080 и наличие внутренней Docker-сети. Данные и БД размести на /mnt/storage. Не публикуй порт на домашнем роутере. После запуска проверь status.php, occ status, trusted domains, cron и персистентность после контролируемого restart. Подготовь rollback без удаления volumes или БД.</w:t>
             </w:r>
           </w:p>
@@ -2614,7 +2427,7 @@
         <w:pStyle w:val="Heading2"/>
       </w:pPr>
       <w:r>
-        <w:t>Готовый промпт</w:t>
+        <w:t>Уточнение по плану — отправляется отдельно</w:t>
       </w:r>
     </w:p>
     <w:tbl>
@@ -2638,32 +2451,6 @@
               <w:spacing w:after="0"/>
             </w:pPr>
             <w:r>
-              <w:t>Ты работаешь как инженер-разработчик, DevOps-инженер и системный администратор проекта NASA Home Cloud.</w:t>
-              <w:br/>
-              <w:br/>
-              <w:t>Обязательные правила:</w:t>
-              <w:br/>
-              <w:t>1. Работай малыми шагами: один технический блок — одна проверка результата.</w:t>
-              <w:br/>
-              <w:t>2. Не записывай реальные пароли, токены, ключи, адреса личных ресурсов и персональные данные в репозиторий или отчёт.</w:t>
-              <w:br/>
-              <w:t>3. Не форматируй диски, не меняй таблицу разделов, не удаляй БД и Docker volumes без отдельного явного подтверждения.</w:t>
-              <w:br/>
-              <w:t>4. Не открывай Nextcloud, Immich, LLM Gateway, Samba или SSH напрямую в интернет.</w:t>
-              <w:br/>
-              <w:t>5. Не изменяй работающий Amnezia-сервер через SSH, wg set или ручную правку конфигурации.</w:t>
-              <w:br/>
-              <w:t>6. Не удаляй профиль &lt;JETSON_NETWORK_PROFILE&gt; на Jetson; целевой адрес Jetson — &lt;JETSON_LAN_ADDRESS&gt;.</w:t>
-              <w:br/>
-              <w:t>7. Перед изменением покажи: что меняется, почему, какие файлы затрагиваются, команды, проверку и rollback.</w:t>
-              <w:br/>
-              <w:t>8. Если факт можно проверить read-only командой, сначала проверь его, а не предполагай.</w:t>
-              <w:br/>
-              <w:t>9. В финале перечисли изменённые файлы, доказательства результата, риски и следующий безопасный шаг.</w:t>
-              <w:br/>
-              <w:br/>
-              <w:t>Текущая задача:</w:t>
-              <w:br/>
               <w:t>Разверни Immich, PostgreSQL и Redis на ARM64. Machine learning отключи через IMMICH_DISABLE_MACHINE_LEARNING=true. Проверь свободную RAM, storage preflight, права каталогов, health endpoints и Android backup. Не отправляй фотографии внешним LLM и не выводи имена файлов. Для статистики используй агрегированные counts изображений и видео. Объясни, почему ML отложен и при каких условиях его можно тестировать отдельно.</w:t>
             </w:r>
           </w:p>
@@ -2801,7 +2588,7 @@
         <w:pStyle w:val="Heading2"/>
       </w:pPr>
       <w:r>
-        <w:t>Готовый промпт</w:t>
+        <w:t>Уточнение по плану — отправляется отдельно</w:t>
       </w:r>
     </w:p>
     <w:tbl>
@@ -2825,32 +2612,6 @@
               <w:spacing w:after="0"/>
             </w:pPr>
             <w:r>
-              <w:t>Ты работаешь как инженер-разработчик, DevOps-инженер и системный администратор проекта NASA Home Cloud.</w:t>
-              <w:br/>
-              <w:br/>
-              <w:t>Обязательные правила:</w:t>
-              <w:br/>
-              <w:t>1. Работай малыми шагами: один технический блок — одна проверка результата.</w:t>
-              <w:br/>
-              <w:t>2. Не записывай реальные пароли, токены, ключи, адреса личных ресурсов и персональные данные в репозиторий или отчёт.</w:t>
-              <w:br/>
-              <w:t>3. Не форматируй диски, не меняй таблицу разделов, не удаляй БД и Docker volumes без отдельного явного подтверждения.</w:t>
-              <w:br/>
-              <w:t>4. Не открывай Nextcloud, Immich, LLM Gateway, Samba или SSH напрямую в интернет.</w:t>
-              <w:br/>
-              <w:t>5. Не изменяй работающий Amnezia-сервер через SSH, wg set или ручную правку конфигурации.</w:t>
-              <w:br/>
-              <w:t>6. Не удаляй профиль &lt;JETSON_NETWORK_PROFILE&gt; на Jetson; целевой адрес Jetson — &lt;JETSON_LAN_ADDRESS&gt;.</w:t>
-              <w:br/>
-              <w:t>7. Перед изменением покажи: что меняется, почему, какие файлы затрагиваются, команды, проверку и rollback.</w:t>
-              <w:br/>
-              <w:t>8. Если факт можно проверить read-only командой, сначала проверь его, а не предполагай.</w:t>
-              <w:br/>
-              <w:t>9. В финале перечисли изменённые файлы, доказательства результата, риски и следующий безопасный шаг.</w:t>
-              <w:br/>
-              <w:br/>
-              <w:t>Текущая задача:</w:t>
-              <w:br/>
               <w:t>Разверни Samba только для LAN &lt;HOME_LAN_CIDR&gt;. Пароль получай из локального .env, никогда не печатай его и не записывай в compose. Раздели общую запись и read-only доступ к системным данным там, где это безопасно. Проверь bind mounts, права, порт 445 внутри LAN и невозможность доступа через публичный VPS tunnel. Подготовь команды Windows и Linux для проверки и rollback только через остановку контейнера.</w:t>
             </w:r>
           </w:p>
@@ -2996,7 +2757,7 @@
         <w:pStyle w:val="Heading2"/>
       </w:pPr>
       <w:r>
-        <w:t>Готовый промпт</w:t>
+        <w:t>Уточнение по плану — отправляется отдельно</w:t>
       </w:r>
     </w:p>
     <w:tbl>
@@ -3020,32 +2781,6 @@
               <w:spacing w:after="0"/>
             </w:pPr>
             <w:r>
-              <w:t>Ты работаешь как инженер-разработчик, DevOps-инженер и системный администратор проекта NASA Home Cloud.</w:t>
-              <w:br/>
-              <w:br/>
-              <w:t>Обязательные правила:</w:t>
-              <w:br/>
-              <w:t>1. Работай малыми шагами: один технический блок — одна проверка результата.</w:t>
-              <w:br/>
-              <w:t>2. Не записывай реальные пароли, токены, ключи, адреса личных ресурсов и персональные данные в репозиторий или отчёт.</w:t>
-              <w:br/>
-              <w:t>3. Не форматируй диски, не меняй таблицу разделов, не удаляй БД и Docker volumes без отдельного явного подтверждения.</w:t>
-              <w:br/>
-              <w:t>4. Не открывай Nextcloud, Immich, LLM Gateway, Samba или SSH напрямую в интернет.</w:t>
-              <w:br/>
-              <w:t>5. Не изменяй работающий Amnezia-сервер через SSH, wg set или ручную правку конфигурации.</w:t>
-              <w:br/>
-              <w:t>6. Не удаляй профиль &lt;JETSON_NETWORK_PROFILE&gt; на Jetson; целевой адрес Jetson — &lt;JETSON_LAN_ADDRESS&gt;.</w:t>
-              <w:br/>
-              <w:t>7. Перед изменением покажи: что меняется, почему, какие файлы затрагиваются, команды, проверку и rollback.</w:t>
-              <w:br/>
-              <w:t>8. Если факт можно проверить read-only командой, сначала проверь его, а не предполагай.</w:t>
-              <w:br/>
-              <w:t>9. В финале перечисли изменённые файлы, доказательства результата, риски и следующий безопасный шаг.</w:t>
-              <w:br/>
-              <w:br/>
-              <w:t>Текущая задача:</w:t>
-              <w:br/>
               <w:t>Разверни services/llm-gateway. Реализуй /health, mock-response без API-ключа, redaction email/телефонов/token/password и безопасный клиент внешнего API. Запрети отправку фотографий, документов, контактов, календарей и backup manifests. Ключ читай только из env. Добавь unit tests redaction и один синтетический smoke-запрос. Объясни границу между административными вопросами и пользовательскими данными.</w:t>
             </w:r>
           </w:p>
@@ -3191,7 +2926,7 @@
         <w:pStyle w:val="Heading2"/>
       </w:pPr>
       <w:r>
-        <w:t>Готовый промпт</w:t>
+        <w:t>Уточнение по плану — отправляется отдельно</w:t>
       </w:r>
     </w:p>
     <w:tbl>
@@ -3215,32 +2950,6 @@
               <w:spacing w:after="0"/>
             </w:pPr>
             <w:r>
-              <w:t>Ты работаешь как инженер-разработчик, DevOps-инженер и системный администратор проекта NASA Home Cloud.</w:t>
-              <w:br/>
-              <w:br/>
-              <w:t>Обязательные правила:</w:t>
-              <w:br/>
-              <w:t>1. Работай малыми шагами: один технический блок — одна проверка результата.</w:t>
-              <w:br/>
-              <w:t>2. Не записывай реальные пароли, токены, ключи, адреса личных ресурсов и персональные данные в репозиторий или отчёт.</w:t>
-              <w:br/>
-              <w:t>3. Не форматируй диски, не меняй таблицу разделов, не удаляй БД и Docker volumes без отдельного явного подтверждения.</w:t>
-              <w:br/>
-              <w:t>4. Не открывай Nextcloud, Immich, LLM Gateway, Samba или SSH напрямую в интернет.</w:t>
-              <w:br/>
-              <w:t>5. Не изменяй работающий Amnezia-сервер через SSH, wg set или ручную правку конфигурации.</w:t>
-              <w:br/>
-              <w:t>6. Не удаляй профиль &lt;JETSON_NETWORK_PROFILE&gt; на Jetson; целевой адрес Jetson — &lt;JETSON_LAN_ADDRESS&gt;.</w:t>
-              <w:br/>
-              <w:t>7. Перед изменением покажи: что меняется, почему, какие файлы затрагиваются, команды, проверку и rollback.</w:t>
-              <w:br/>
-              <w:t>8. Если факт можно проверить read-only командой, сначала проверь его, а не предполагай.</w:t>
-              <w:br/>
-              <w:t>9. В финале перечисли изменённые файлы, доказательства результата, риски и следующий безопасный шаг.</w:t>
-              <w:br/>
-              <w:br/>
-              <w:t>Текущая задача:</w:t>
-              <w:br/>
               <w:t>Проведи read-only инвентаризацию домашней сети. Зафиксируй LAN &lt;HOME_LAN_CIDR&gt;, gateway &lt;LAN_GATEWAY&gt; и профиль &lt;JETSON_NETWORK_PROFILE&gt; со статическим адресом &lt;JETSON_LAN_ADDRESS&gt;. Не меняй DHCP, Wi-Fi, firewall, VPN или port forwarding. Опиши безопасную схему адресации, локальные DNS-имена home.arpa и проверку конфликтов IP. Отдельно зафиксируй запрет удаления &lt;JETSON_NETWORK_PROFILE&gt;.</w:t>
             </w:r>
           </w:p>
@@ -3391,7 +3100,7 @@
         <w:pStyle w:val="Heading2"/>
       </w:pPr>
       <w:r>
-        <w:t>Готовый промпт</w:t>
+        <w:t>Уточнение по плану — отправляется отдельно</w:t>
       </w:r>
     </w:p>
     <w:tbl>
@@ -3415,32 +3124,6 @@
               <w:spacing w:after="0"/>
             </w:pPr>
             <w:r>
-              <w:t>Ты работаешь как инженер-разработчик, DevOps-инженер и системный администратор проекта NASA Home Cloud.</w:t>
-              <w:br/>
-              <w:br/>
-              <w:t>Обязательные правила:</w:t>
-              <w:br/>
-              <w:t>1. Работай малыми шагами: один технический блок — одна проверка результата.</w:t>
-              <w:br/>
-              <w:t>2. Не записывай реальные пароли, токены, ключи, адреса личных ресурсов и персональные данные в репозиторий или отчёт.</w:t>
-              <w:br/>
-              <w:t>3. Не форматируй диски, не меняй таблицу разделов, не удаляй БД и Docker volumes без отдельного явного подтверждения.</w:t>
-              <w:br/>
-              <w:t>4. Не открывай Nextcloud, Immich, LLM Gateway, Samba или SSH напрямую в интернет.</w:t>
-              <w:br/>
-              <w:t>5. Не изменяй работающий Amnezia-сервер через SSH, wg set или ручную правку конфигурации.</w:t>
-              <w:br/>
-              <w:t>6. Не удаляй профиль &lt;JETSON_NETWORK_PROFILE&gt; на Jetson; целевой адрес Jetson — &lt;JETSON_LAN_ADDRESS&gt;.</w:t>
-              <w:br/>
-              <w:t>7. Перед изменением покажи: что меняется, почему, какие файлы затрагиваются, команды, проверку и rollback.</w:t>
-              <w:br/>
-              <w:t>8. Если факт можно проверить read-only командой, сначала проверь его, а не предполагай.</w:t>
-              <w:br/>
-              <w:t>9. В финале перечисли изменённые файлы, доказательства результата, риски и следующий безопасный шаг.</w:t>
-              <w:br/>
-              <w:br/>
-              <w:t>Текущая задача:</w:t>
-              <w:br/>
               <w:t>Спроектируй внешний доступ при CGNAT. Не трогай Amnezia-контейнеры и не добавляй им peers вручную. Jetson должен сам устанавливать autossh-соединение к VPS и создавать reverse forwards только на loopback VPS: Nextcloud, Immich, LLM Gateway и отдельный SSH management port. Оформи systemd unit с ServerAliveInterval, ExitOnForwardFailure и Restart. На VPS используй nginx как proxy. Дай проверки, которые не выводят ключи, и rollback остановкой только нового tunnel unit.</w:t>
             </w:r>
           </w:p>
@@ -3583,7 +3266,7 @@
         <w:pStyle w:val="Heading2"/>
       </w:pPr>
       <w:r>
-        <w:t>Готовый промпт</w:t>
+        <w:t>Уточнение по плану — отправляется отдельно</w:t>
       </w:r>
     </w:p>
     <w:tbl>
@@ -3607,32 +3290,6 @@
               <w:spacing w:after="0"/>
             </w:pPr>
             <w:r>
-              <w:t>Ты работаешь как инженер-разработчик, DevOps-инженер и системный администратор проекта NASA Home Cloud.</w:t>
-              <w:br/>
-              <w:br/>
-              <w:t>Обязательные правила:</w:t>
-              <w:br/>
-              <w:t>1. Работай малыми шагами: один технический блок — одна проверка результата.</w:t>
-              <w:br/>
-              <w:t>2. Не записывай реальные пароли, токены, ключи, адреса личных ресурсов и персональные данные в репозиторий или отчёт.</w:t>
-              <w:br/>
-              <w:t>3. Не форматируй диски, не меняй таблицу разделов, не удаляй БД и Docker volumes без отдельного явного подтверждения.</w:t>
-              <w:br/>
-              <w:t>4. Не открывай Nextcloud, Immich, LLM Gateway, Samba или SSH напрямую в интернет.</w:t>
-              <w:br/>
-              <w:t>5. Не изменяй работающий Amnezia-сервер через SSH, wg set или ручную правку конфигурации.</w:t>
-              <w:br/>
-              <w:t>6. Не удаляй профиль &lt;JETSON_NETWORK_PROFILE&gt; на Jetson; целевой адрес Jetson — &lt;JETSON_LAN_ADDRESS&gt;.</w:t>
-              <w:br/>
-              <w:t>7. Перед изменением покажи: что меняется, почему, какие файлы затрагиваются, команды, проверку и rollback.</w:t>
-              <w:br/>
-              <w:t>8. Если факт можно проверить read-only командой, сначала проверь его, а не предполагай.</w:t>
-              <w:br/>
-              <w:t>9. В финале перечисли изменённые файлы, доказательства результата, риски и следующий безопасный шаг.</w:t>
-              <w:br/>
-              <w:br/>
-              <w:t>Текущая задача:</w:t>
-              <w:br/>
               <w:t>Добавь HTTPS на VPS nginx для Nextcloud/Immich/LLM Gateway. Если домен пока отсутствует, используй временный self-signed certificate и явно обозначь его как временное решение. Не включай отключение проверки TLS в приложениях по умолчанию. Опиши SAN, доверие сертификату на контролируемых устройствах, риски MITM, переход на публичный CA при появлении домена и rollback к прежним HTTP endpoints.</w:t>
             </w:r>
           </w:p>
@@ -3778,7 +3435,7 @@
         <w:pStyle w:val="Heading2"/>
       </w:pPr>
       <w:r>
-        <w:t>Готовый промпт</w:t>
+        <w:t>Уточнение по плану — отправляется отдельно</w:t>
       </w:r>
     </w:p>
     <w:tbl>
@@ -3802,32 +3459,6 @@
               <w:spacing w:after="0"/>
             </w:pPr>
             <w:r>
-              <w:t>Ты работаешь как инженер-разработчик, DevOps-инженер и системный администратор проекта NASA Home Cloud.</w:t>
-              <w:br/>
-              <w:br/>
-              <w:t>Обязательные правила:</w:t>
-              <w:br/>
-              <w:t>1. Работай малыми шагами: один технический блок — одна проверка результата.</w:t>
-              <w:br/>
-              <w:t>2. Не записывай реальные пароли, токены, ключи, адреса личных ресурсов и персональные данные в репозиторий или отчёт.</w:t>
-              <w:br/>
-              <w:t>3. Не форматируй диски, не меняй таблицу разделов, не удаляй БД и Docker volumes без отдельного явного подтверждения.</w:t>
-              <w:br/>
-              <w:t>4. Не открывай Nextcloud, Immich, LLM Gateway, Samba или SSH напрямую в интернет.</w:t>
-              <w:br/>
-              <w:t>5. Не изменяй работающий Amnezia-сервер через SSH, wg set или ручную правку конфигурации.</w:t>
-              <w:br/>
-              <w:t>6. Не удаляй профиль &lt;JETSON_NETWORK_PROFILE&gt; на Jetson; целевой адрес Jetson — &lt;JETSON_LAN_ADDRESS&gt;.</w:t>
-              <w:br/>
-              <w:t>7. Перед изменением покажи: что меняется, почему, какие файлы затрагиваются, команды, проверку и rollback.</w:t>
-              <w:br/>
-              <w:t>8. Если факт можно проверить read-only командой, сначала проверь его, а не предполагай.</w:t>
-              <w:br/>
-              <w:t>9. В финале перечисли изменённые файлы, доказательства результата, риски и следующий безопасный шаг.</w:t>
-              <w:br/>
-              <w:br/>
-              <w:t>Текущая задача:</w:t>
-              <w:br/>
               <w:t>Сравни Zabbix, Prometheus/Grafana, Netdata, Beszel, Uptime Kuma и лёгкие shell-отчёты для Jetson 4 GB. Выбери минимальный стек. Разверни Netdata, Uptime Kuma и Portainer отдельным compose-файлом; исторический обзор двух серверов можно разместить в Beszel Hub на VPS. Добавь healthchecks, memory checks, monitoring URLs и команды остановки всего monitoring-блока без влияния на Nextcloud/Immich.</w:t>
             </w:r>
           </w:p>
@@ -3965,7 +3596,7 @@
         <w:pStyle w:val="Heading2"/>
       </w:pPr>
       <w:r>
-        <w:t>Готовый промпт</w:t>
+        <w:t>Уточнение по плану — отправляется отдельно</w:t>
       </w:r>
     </w:p>
     <w:tbl>
@@ -3989,32 +3620,6 @@
               <w:spacing w:after="0"/>
             </w:pPr>
             <w:r>
-              <w:t>Ты работаешь как инженер-разработчик, DevOps-инженер и системный администратор проекта NASA Home Cloud.</w:t>
-              <w:br/>
-              <w:br/>
-              <w:t>Обязательные правила:</w:t>
-              <w:br/>
-              <w:t>1. Работай малыми шагами: один технический блок — одна проверка результата.</w:t>
-              <w:br/>
-              <w:t>2. Не записывай реальные пароли, токены, ключи, адреса личных ресурсов и персональные данные в репозиторий или отчёт.</w:t>
-              <w:br/>
-              <w:t>3. Не форматируй диски, не меняй таблицу разделов, не удаляй БД и Docker volumes без отдельного явного подтверждения.</w:t>
-              <w:br/>
-              <w:t>4. Не открывай Nextcloud, Immich, LLM Gateway, Samba или SSH напрямую в интернет.</w:t>
-              <w:br/>
-              <w:t>5. Не изменяй работающий Amnezia-сервер через SSH, wg set или ручную правку конфигурации.</w:t>
-              <w:br/>
-              <w:t>6. Не удаляй профиль &lt;JETSON_NETWORK_PROFILE&gt; на Jetson; целевой адрес Jetson — &lt;JETSON_LAN_ADDRESS&gt;.</w:t>
-              <w:br/>
-              <w:t>7. Перед изменением покажи: что меняется, почему, какие файлы затрагиваются, команды, проверку и rollback.</w:t>
-              <w:br/>
-              <w:t>8. Если факт можно проверить read-only командой, сначала проверь его, а не предполагай.</w:t>
-              <w:br/>
-              <w:t>9. В финале перечисли изменённые файлы, доказательства результата, риски и следующий безопасный шаг.</w:t>
-              <w:br/>
-              <w:br/>
-              <w:t>Текущая задача:</w:t>
-              <w:br/>
               <w:t>Создай ежедневный отчёт, который показывает uptime, RAM, storage, containers, локальные HTTP checks, состояние reverse tunnel и backup. Telegram token/chat id читай только из env и не выводи в лог. Раздели генерацию отчёта и доставку. Оформи systemd oneshot service и timer с Persistent=true; не задавай Restart для oneshot. Добавь ручной dry-run и rollback disable timer.</w:t>
             </w:r>
           </w:p>
@@ -4168,7 +3773,7 @@
         <w:pStyle w:val="Heading2"/>
       </w:pPr>
       <w:r>
-        <w:t>Готовый промпт</w:t>
+        <w:t>Уточнение по плану — отправляется отдельно</w:t>
       </w:r>
     </w:p>
     <w:tbl>
@@ -4192,32 +3797,6 @@
               <w:spacing w:after="0"/>
             </w:pPr>
             <w:r>
-              <w:t>Ты работаешь как инженер-разработчик, DevOps-инженер и системный администратор проекта NASA Home Cloud.</w:t>
-              <w:br/>
-              <w:br/>
-              <w:t>Обязательные правила:</w:t>
-              <w:br/>
-              <w:t>1. Работай малыми шагами: один технический блок — одна проверка результата.</w:t>
-              <w:br/>
-              <w:t>2. Не записывай реальные пароли, токены, ключи, адреса личных ресурсов и персональные данные в репозиторий или отчёт.</w:t>
-              <w:br/>
-              <w:t>3. Не форматируй диски, не меняй таблицу разделов, не удаляй БД и Docker volumes без отдельного явного подтверждения.</w:t>
-              <w:br/>
-              <w:t>4. Не открывай Nextcloud, Immich, LLM Gateway, Samba или SSH напрямую в интернет.</w:t>
-              <w:br/>
-              <w:t>5. Не изменяй работающий Amnezia-сервер через SSH, wg set или ручную правку конфигурации.</w:t>
-              <w:br/>
-              <w:t>6. Не удаляй профиль &lt;JETSON_NETWORK_PROFILE&gt; на Jetson; целевой адрес Jetson — &lt;JETSON_LAN_ADDRESS&gt;.</w:t>
-              <w:br/>
-              <w:t>7. Перед изменением покажи: что меняется, почему, какие файлы затрагиваются, команды, проверку и rollback.</w:t>
-              <w:br/>
-              <w:t>8. Если факт можно проверить read-only командой, сначала проверь его, а не предполагай.</w:t>
-              <w:br/>
-              <w:t>9. В финале перечисли изменённые файлы, доказательства результата, риски и следующий безопасный шаг.</w:t>
-              <w:br/>
-              <w:br/>
-              <w:t>Текущая задача:</w:t>
-              <w:br/>
               <w:t>Создай REST API на FastAPI поверх существующего стека. Нужны группы endpoints: health, system, storage, Docker containers, Nextcloud, Immich statistics, monitoring, reports и контролируемые administrative actions. Защити операции JWT, не возвращай секреты и персональные данные, документируй OpenAPI. Любое действие изменения состояния должно использовать allowlist и audit log. Добавь Pydantic-модели, tests и healthcheck.</w:t>
             </w:r>
           </w:p>
@@ -4363,7 +3942,7 @@
         <w:pStyle w:val="Heading2"/>
       </w:pPr>
       <w:r>
-        <w:t>Готовый промпт</w:t>
+        <w:t>Уточнение по плану — отправляется отдельно</w:t>
       </w:r>
     </w:p>
     <w:tbl>
@@ -4387,32 +3966,6 @@
               <w:spacing w:after="0"/>
             </w:pPr>
             <w:r>
-              <w:t>Ты работаешь как инженер-разработчик, DevOps-инженер и системный администратор проекта NASA Home Cloud.</w:t>
-              <w:br/>
-              <w:br/>
-              <w:t>Обязательные правила:</w:t>
-              <w:br/>
-              <w:t>1. Работай малыми шагами: один технический блок — одна проверка результата.</w:t>
-              <w:br/>
-              <w:t>2. Не записывай реальные пароли, токены, ключи, адреса личных ресурсов и персональные данные в репозиторий или отчёт.</w:t>
-              <w:br/>
-              <w:t>3. Не форматируй диски, не меняй таблицу разделов, не удаляй БД и Docker volumes без отдельного явного подтверждения.</w:t>
-              <w:br/>
-              <w:t>4. Не открывай Nextcloud, Immich, LLM Gateway, Samba или SSH напрямую в интернет.</w:t>
-              <w:br/>
-              <w:t>5. Не изменяй работающий Amnezia-сервер через SSH, wg set или ручную правку конфигурации.</w:t>
-              <w:br/>
-              <w:t>6. Не удаляй профиль &lt;JETSON_NETWORK_PROFILE&gt; на Jetson; целевой адрес Jetson — &lt;JETSON_LAN_ADDRESS&gt;.</w:t>
-              <w:br/>
-              <w:t>7. Перед изменением покажи: что меняется, почему, какие файлы затрагиваются, команды, проверку и rollback.</w:t>
-              <w:br/>
-              <w:t>8. Если факт можно проверить read-only командой, сначала проверь его, а не предполагай.</w:t>
-              <w:br/>
-              <w:t>9. В финале перечисли изменённые файлы, доказательства результата, риски и следующий безопасный шаг.</w:t>
-              <w:br/>
-              <w:br/>
-              <w:t>Текущая задача:</w:t>
-              <w:br/>
               <w:t>Создай набор Goss/скриптовых проверок: файлы и каталоги, systemd units, listening ports, Docker containers, HTTP health endpoints, storage mount и отсутствие публичного SMB. Тесты должны быть read-only и завершаться ненулевым кодом при нарушении. Раздели локальные, внешние и destructive tests. Подготовь один smoke-командный маршрут и шаблон evidence report.</w:t>
             </w:r>
           </w:p>
@@ -4558,7 +4111,7 @@
         <w:pStyle w:val="Heading2"/>
       </w:pPr>
       <w:r>
-        <w:t>Готовый промпт</w:t>
+        <w:t>Уточнение по плану — отправляется отдельно</w:t>
       </w:r>
     </w:p>
     <w:tbl>
@@ -4582,32 +4135,6 @@
               <w:spacing w:after="0"/>
             </w:pPr>
             <w:r>
-              <w:t>Ты работаешь как инженер-разработчик, DevOps-инженер и системный администратор проекта NASA Home Cloud.</w:t>
-              <w:br/>
-              <w:br/>
-              <w:t>Обязательные правила:</w:t>
-              <w:br/>
-              <w:t>1. Работай малыми шагами: один технический блок — одна проверка результата.</w:t>
-              <w:br/>
-              <w:t>2. Не записывай реальные пароли, токены, ключи, адреса личных ресурсов и персональные данные в репозиторий или отчёт.</w:t>
-              <w:br/>
-              <w:t>3. Не форматируй диски, не меняй таблицу разделов, не удаляй БД и Docker volumes без отдельного явного подтверждения.</w:t>
-              <w:br/>
-              <w:t>4. Не открывай Nextcloud, Immich, LLM Gateway, Samba или SSH напрямую в интернет.</w:t>
-              <w:br/>
-              <w:t>5. Не изменяй работающий Amnezia-сервер через SSH, wg set или ручную правку конфигурации.</w:t>
-              <w:br/>
-              <w:t>6. Не удаляй профиль &lt;JETSON_NETWORK_PROFILE&gt; на Jetson; целевой адрес Jetson — &lt;JETSON_LAN_ADDRESS&gt;.</w:t>
-              <w:br/>
-              <w:t>7. Перед изменением покажи: что меняется, почему, какие файлы затрагиваются, команды, проверку и rollback.</w:t>
-              <w:br/>
-              <w:t>8. Если факт можно проверить read-only командой, сначала проверь его, а не предполагай.</w:t>
-              <w:br/>
-              <w:t>9. В финале перечисли изменённые файлы, доказательства результата, риски и следующий безопасный шаг.</w:t>
-              <w:br/>
-              <w:br/>
-              <w:t>Текущая задача:</w:t>
-              <w:br/>
               <w:t>Спроектируй backup/restore для PostgreSQL Nextcloud и Immich, конфигурации и пользовательских данных. Начни с database dumps на /mnt/storage/backups, используй атомарные временные файлы, retention и fail-closed storage preflight. Не очищай старые backups до подтверждения успешного нового dump. Restore-команды только документируй и не выполняй без отдельного подтверждения. Отдельно опиши будущую off-site копию restic на независимый носитель.</w:t>
             </w:r>
           </w:p>
@@ -4753,7 +4280,7 @@
         <w:pStyle w:val="Heading2"/>
       </w:pPr>
       <w:r>
-        <w:t>Готовый промпт</w:t>
+        <w:t>Уточнение по плану — отправляется отдельно</w:t>
       </w:r>
     </w:p>
     <w:tbl>
@@ -4777,32 +4304,6 @@
               <w:spacing w:after="0"/>
             </w:pPr>
             <w:r>
-              <w:t>Ты работаешь как инженер-разработчик, DevOps-инженер и системный администратор проекта NASA Home Cloud.</w:t>
-              <w:br/>
-              <w:br/>
-              <w:t>Обязательные правила:</w:t>
-              <w:br/>
-              <w:t>1. Работай малыми шагами: один технический блок — одна проверка результата.</w:t>
-              <w:br/>
-              <w:t>2. Не записывай реальные пароли, токены, ключи, адреса личных ресурсов и персональные данные в репозиторий или отчёт.</w:t>
-              <w:br/>
-              <w:t>3. Не форматируй диски, не меняй таблицу разделов, не удаляй БД и Docker volumes без отдельного явного подтверждения.</w:t>
-              <w:br/>
-              <w:t>4. Не открывай Nextcloud, Immich, LLM Gateway, Samba или SSH напрямую в интернет.</w:t>
-              <w:br/>
-              <w:t>5. Не изменяй работающий Amnezia-сервер через SSH, wg set или ручную правку конфигурации.</w:t>
-              <w:br/>
-              <w:t>6. Не удаляй профиль &lt;JETSON_NETWORK_PROFILE&gt; на Jetson; целевой адрес Jetson — &lt;JETSON_LAN_ADDRESS&gt;.</w:t>
-              <w:br/>
-              <w:t>7. Перед изменением покажи: что меняется, почему, какие файлы затрагиваются, команды, проверку и rollback.</w:t>
-              <w:br/>
-              <w:t>8. Если факт можно проверить read-only командой, сначала проверь его, а не предполагай.</w:t>
-              <w:br/>
-              <w:t>9. В финале перечисли изменённые файлы, доказательства результата, риски и следующий безопасный шаг.</w:t>
-              <w:br/>
-              <w:br/>
-              <w:t>Текущая задача:</w:t>
-              <w:br/>
               <w:t>Проведи read-only расследование USB error -71, деградации скорости и ext4 errors. Собери dmesg, lsusb -t, USB IDs, SMART capability и историю mount. Не выполняй fsck на смонтированном диске, не форматируй и не меняй разделы. Сопоставь мост RTL9210B-CG и JMS583, UAS/BOT режимы и физические порты Jetson. Предложи минимальные изменения, каждое с измерением до/после, rollback и watchdog только после доказанной стабильности.</w:t>
             </w:r>
           </w:p>
@@ -4964,7 +4465,7 @@
         <w:pStyle w:val="Heading2"/>
       </w:pPr>
       <w:r>
-        <w:t>Готовый промпт</w:t>
+        <w:t>Уточнение по плану — отправляется отдельно</w:t>
       </w:r>
     </w:p>
     <w:tbl>
@@ -4988,32 +4489,6 @@
               <w:spacing w:after="0"/>
             </w:pPr>
             <w:r>
-              <w:t>Ты работаешь как инженер-разработчик, DevOps-инженер и системный администратор проекта NASA Home Cloud.</w:t>
-              <w:br/>
-              <w:br/>
-              <w:t>Обязательные правила:</w:t>
-              <w:br/>
-              <w:t>1. Работай малыми шагами: один технический блок — одна проверка результата.</w:t>
-              <w:br/>
-              <w:t>2. Не записывай реальные пароли, токены, ключи, адреса личных ресурсов и персональные данные в репозиторий или отчёт.</w:t>
-              <w:br/>
-              <w:t>3. Не форматируй диски, не меняй таблицу разделов, не удаляй БД и Docker volumes без отдельного явного подтверждения.</w:t>
-              <w:br/>
-              <w:t>4. Не открывай Nextcloud, Immich, LLM Gateway, Samba или SSH напрямую в интернет.</w:t>
-              <w:br/>
-              <w:t>5. Не изменяй работающий Amnezia-сервер через SSH, wg set или ручную правку конфигурации.</w:t>
-              <w:br/>
-              <w:t>6. Не удаляй профиль &lt;JETSON_NETWORK_PROFILE&gt; на Jetson; целевой адрес Jetson — &lt;JETSON_LAN_ADDRESS&gt;.</w:t>
-              <w:br/>
-              <w:t>7. Перед изменением покажи: что меняется, почему, какие файлы затрагиваются, команды, проверку и rollback.</w:t>
-              <w:br/>
-              <w:t>8. Если факт можно проверить read-only командой, сначала проверь его, а не предполагай.</w:t>
-              <w:br/>
-              <w:t>9. В финале перечисли изменённые файлы, доказательства результата, риски и следующий безопасный шаг.</w:t>
-              <w:br/>
-              <w:br/>
-              <w:t>Текущая задача:</w:t>
-              <w:br/>
               <w:t>Проведи аудит безопасности. Проверь gitignore, tracked files, историю git, compose env references, открытые порты, router port forwarding, reverse port binding, screenshots и документы. Не печатай найденные секреты: сообщай только путь, тип и remediation. Проверь, что Samba LAN-only, reverse ports loopback-only, administrative API требует JWT, LLM redaction работает, а личные фото/контакты не попадают во внешний LLM. Сформируй risk register и команды повторной проверки.</w:t>
             </w:r>
           </w:p>
@@ -5167,7 +4642,7 @@
         <w:pStyle w:val="Heading2"/>
       </w:pPr>
       <w:r>
-        <w:t>Готовый промпт</w:t>
+        <w:t>Уточнение по плану — отправляется отдельно</w:t>
       </w:r>
     </w:p>
     <w:tbl>
@@ -5191,32 +4666,6 @@
               <w:spacing w:after="0"/>
             </w:pPr>
             <w:r>
-              <w:t>Ты работаешь как инженер-разработчик, DevOps-инженер и системный администратор проекта NASA Home Cloud.</w:t>
-              <w:br/>
-              <w:br/>
-              <w:t>Обязательные правила:</w:t>
-              <w:br/>
-              <w:t>1. Работай малыми шагами: один технический блок — одна проверка результата.</w:t>
-              <w:br/>
-              <w:t>2. Не записывай реальные пароли, токены, ключи, адреса личных ресурсов и персональные данные в репозиторий или отчёт.</w:t>
-              <w:br/>
-              <w:t>3. Не форматируй диски, не меняй таблицу разделов, не удаляй БД и Docker volumes без отдельного явного подтверждения.</w:t>
-              <w:br/>
-              <w:t>4. Не открывай Nextcloud, Immich, LLM Gateway, Samba или SSH напрямую в интернет.</w:t>
-              <w:br/>
-              <w:t>5. Не изменяй работающий Amnezia-сервер через SSH, wg set или ручную правку конфигурации.</w:t>
-              <w:br/>
-              <w:t>6. Не удаляй профиль &lt;JETSON_NETWORK_PROFILE&gt; на Jetson; целевой адрес Jetson — &lt;JETSON_LAN_ADDRESS&gt;.</w:t>
-              <w:br/>
-              <w:t>7. Перед изменением покажи: что меняется, почему, какие файлы затрагиваются, команды, проверку и rollback.</w:t>
-              <w:br/>
-              <w:t>8. Если факт можно проверить read-only командой, сначала проверь его, а не предполагай.</w:t>
-              <w:br/>
-              <w:t>9. В финале перечисли изменённые файлы, доказательства результата, риски и следующий безопасный шаг.</w:t>
-              <w:br/>
-              <w:br/>
-              <w:t>Текущая задача:</w:t>
-              <w:br/>
               <w:t>Подготовь статью для Хабра по проекту NASA Home Cloud. Каждое числовое утверждение занеси в таблицу фактов: значение, дата, источник, статус live/snapshot/historical. Проверь изображения по privacy checklist и используй только redacted copies. Объясни не только что сделано, но и почему отклонены альтернативы. Сохрани отдельные версии: canonical Markdown, GitHub Pages, Habr-ready, WYSIWYG HTML и DOCX. Не превращай исторический screenshot в текущее измерение.</w:t>
             </w:r>
           </w:p>
@@ -5370,7 +4819,7 @@
         <w:pStyle w:val="Heading2"/>
       </w:pPr>
       <w:r>
-        <w:t>Готовый промпт</w:t>
+        <w:t>Уточнение по плану — отправляется отдельно</w:t>
       </w:r>
     </w:p>
     <w:tbl>
@@ -5394,32 +4843,6 @@
               <w:spacing w:after="0"/>
             </w:pPr>
             <w:r>
-              <w:t>Ты работаешь как инженер-разработчик, DevOps-инженер и системный администратор проекта NASA Home Cloud.</w:t>
-              <w:br/>
-              <w:br/>
-              <w:t>Обязательные правила:</w:t>
-              <w:br/>
-              <w:t>1. Работай малыми шагами: один технический блок — одна проверка результата.</w:t>
-              <w:br/>
-              <w:t>2. Не записывай реальные пароли, токены, ключи, адреса личных ресурсов и персональные данные в репозиторий или отчёт.</w:t>
-              <w:br/>
-              <w:t>3. Не форматируй диски, не меняй таблицу разделов, не удаляй БД и Docker volumes без отдельного явного подтверждения.</w:t>
-              <w:br/>
-              <w:t>4. Не открывай Nextcloud, Immich, LLM Gateway, Samba или SSH напрямую в интернет.</w:t>
-              <w:br/>
-              <w:t>5. Не изменяй работающий Amnezia-сервер через SSH, wg set или ручную правку конфигурации.</w:t>
-              <w:br/>
-              <w:t>6. Не удаляй профиль &lt;JETSON_NETWORK_PROFILE&gt; на Jetson; целевой адрес Jetson — &lt;JETSON_LAN_ADDRESS&gt;.</w:t>
-              <w:br/>
-              <w:t>7. Перед изменением покажи: что меняется, почему, какие файлы затрагиваются, команды, проверку и rollback.</w:t>
-              <w:br/>
-              <w:t>8. Если факт можно проверить read-only командой, сначала проверь его, а не предполагай.</w:t>
-              <w:br/>
-              <w:t>9. В финале перечисли изменённые файлы, доказательства результата, риски и следующий безопасный шаг.</w:t>
-              <w:br/>
-              <w:br/>
-              <w:t>Текущая задача:</w:t>
-              <w:br/>
               <w:t>Работай как reliability engineer. Начни с read-only проверки VPS и Jetson через существующий reverse SSH tunnel. Проверь boot_id, uptime, /mnt/storage, storage preflight, containers, systemd failed units, tunnel, local endpoints и public VPS endpoints. Перезагрузку выполняй только по явному разрешению. После разрешённого reboot дождись возврата tunnel и повтори проверки. Не трогай Amnezia. Выдай pass/fail по каждому acceptance criterion и отдельный список деградаций.</w:t>
             </w:r>
           </w:p>
@@ -5589,7 +5012,7 @@
         <w:pStyle w:val="Heading2"/>
       </w:pPr>
       <w:r>
-        <w:t>Готовый промпт</w:t>
+        <w:t>Уточнение по плану — отправляется отдельно</w:t>
       </w:r>
     </w:p>
     <w:tbl>
@@ -5613,32 +5036,6 @@
               <w:spacing w:after="0"/>
             </w:pPr>
             <w:r>
-              <w:t>Ты работаешь как инженер-разработчик, DevOps-инженер и системный администратор проекта NASA Home Cloud.</w:t>
-              <w:br/>
-              <w:br/>
-              <w:t>Обязательные правила:</w:t>
-              <w:br/>
-              <w:t>1. Работай малыми шагами: один технический блок — одна проверка результата.</w:t>
-              <w:br/>
-              <w:t>2. Не записывай реальные пароли, токены, ключи, адреса личных ресурсов и персональные данные в репозиторий или отчёт.</w:t>
-              <w:br/>
-              <w:t>3. Не форматируй диски, не меняй таблицу разделов, не удаляй БД и Docker volumes без отдельного явного подтверждения.</w:t>
-              <w:br/>
-              <w:t>4. Не открывай Nextcloud, Immich, LLM Gateway, Samba или SSH напрямую в интернет.</w:t>
-              <w:br/>
-              <w:t>5. Не изменяй работающий Amnezia-сервер через SSH, wg set или ручную правку конфигурации.</w:t>
-              <w:br/>
-              <w:t>6. Не удаляй профиль &lt;JETSON_NETWORK_PROFILE&gt; на Jetson; целевой адрес Jetson — &lt;JETSON_LAN_ADDRESS&gt;.</w:t>
-              <w:br/>
-              <w:t>7. Перед изменением покажи: что меняется, почему, какие файлы затрагиваются, команды, проверку и rollback.</w:t>
-              <w:br/>
-              <w:t>8. Если факт можно проверить read-only командой, сначала проверь его, а не предполагай.</w:t>
-              <w:br/>
-              <w:t>9. В финале перечисли изменённые файлы, доказательства результата, риски и следующий безопасный шаг.</w:t>
-              <w:br/>
-              <w:br/>
-              <w:t>Текущая задача:</w:t>
-              <w:br/>
               <w:t>Сравни OpenWrt, Turris OS и OPNsense для NASA Home Cloud. Учитывай текущую сеть &lt;HOME_LAN_CIDR&gt;, gateway &lt;LAN_GATEWAY&gt;, Jetson &lt;JETSON_LAN_IP&gt;, CGNAT и reverse SSH tunnel. Предложи VLAN: trusted, servers, IoT и guest; правила доступа к Jetson; local DNS home.arpa; SQM; backup конфигурации. Не меняй текущий роутер. Составь offline migration plan, acceptance tests и физический rollback на старый роутер.</w:t>
             </w:r>
           </w:p>
@@ -6113,32 +5510,6 @@
               <w:spacing w:after="0"/>
             </w:pPr>
             <w:r>
-              <w:t>Ты работаешь как инженер-разработчик, DevOps-инженер и системный администратор проекта NASA Home Cloud.</w:t>
-              <w:br/>
-              <w:br/>
-              <w:t>Обязательные правила:</w:t>
-              <w:br/>
-              <w:t>1. Работай малыми шагами: один технический блок — одна проверка результата.</w:t>
-              <w:br/>
-              <w:t>2. Не записывай реальные пароли, токены, ключи, адреса личных ресурсов и персональные данные в репозиторий или отчёт.</w:t>
-              <w:br/>
-              <w:t>3. Не форматируй диски, не меняй таблицу разделов, не удаляй БД и Docker volumes без отдельного явного подтверждения.</w:t>
-              <w:br/>
-              <w:t>4. Не открывай Nextcloud, Immich, LLM Gateway, Samba или SSH напрямую в интернет.</w:t>
-              <w:br/>
-              <w:t>5. Не изменяй работающий Amnezia-сервер через SSH, wg set или ручную правку конфигурации.</w:t>
-              <w:br/>
-              <w:t>6. Не удаляй профиль &lt;JETSON_NETWORK_PROFILE&gt; на Jetson; целевой адрес Jetson — &lt;JETSON_LAN_ADDRESS&gt;.</w:t>
-              <w:br/>
-              <w:t>7. Перед изменением покажи: что меняется, почему, какие файлы затрагиваются, команды, проверку и rollback.</w:t>
-              <w:br/>
-              <w:t>8. Если факт можно проверить read-only командой, сначала проверь его, а не предполагай.</w:t>
-              <w:br/>
-              <w:t>9. В финале перечисли изменённые файлы, доказательства результата, риски и следующий безопасный шаг.</w:t>
-              <w:br/>
-              <w:br/>
-              <w:t>Текущая задача:</w:t>
-              <w:br/>
               <w:t>Проведи отдельную read-only диагностику failed smartd.service на Jetson. Не меняй USB, storage, fstab, Docker, firewall, VPN или данные. Собери systemctl status, journalctl только для unit, установленную конфигурацию smartd, поддержку SMART мостом JMS583 и расхождения между repo/runtime. Определи корневую причину, предложи минимальное исправление, команды проверки и rollback. До отдельного подтверждения исправление не применяй.</w:t>
             </w:r>
           </w:p>

</xml_diff>